<commit_message>
Fold Auditoria de Voz into Caixa Cheia v2 + add Salão Aurora sample
Rung 0 is now the customer+brand voice audit (public data, unsolicited
gift): gap analysis with money bridge, voice-profile and drift-reason
extraction wired into the ONDAS wave engine. Adds verified delivery
chain (Trinks debt/package exports, Asaas split, reviews APIs) and the
watermarked fictitious sample audit artifact.

Co-Authored-By: Claude Fable 5 <noreply@anthropic.com>
Claude-Session: https://claude.ai/code/session_014mavYpYo1uVZXnrTYH94be
</commit_message>
<xml_diff>
--- a/CAIXA_CHEIA_V2.docx
+++ b/CAIXA_CHEIA_V2.docx
@@ -436,7 +436,7 @@
                 <w:sz w:val="22"/>
                 <w:szCs w:val="22"/>
               </w:rPr>
-              <w:t xml:space="preserve">Auditoria por Áudio (free)</w:t>
+              <w:t xml:space="preserve">Auditoria de Voz (free gift)</w:t>
             </w:r>
           </w:p>
         </w:tc>
@@ -461,7 +461,7 @@
                 <w:sz w:val="22"/>
                 <w:szCs w:val="22"/>
               </w:rPr>
-              <w:t xml:space="preserve">R$0 · self-serve</w:t>
+              <w:t xml:space="preserve">R$0 · unsolicited</w:t>
             </w:r>
           </w:p>
         </w:tc>
@@ -486,7 +486,7 @@
                 <w:sz w:val="22"/>
                 <w:szCs w:val="22"/>
               </w:rPr>
-              <w:t xml:space="preserve">Owner answers 8 questions by WhatsApp voice note; gets a personalized PDF estimating her leak. Lead capture, zero marginal cost.</w:t>
+              <w:t xml:space="preserve">Built from PUBLIC data only: what her clients say in reviews vs. what her brand projects — the gap, with real quotes, ending on the money bridge. Requires nothing from her. Lead magnet + voice calibration + recovery intelligence in one artifact.</w:t>
             </w:r>
           </w:p>
         </w:tc>
@@ -899,6 +899,30 @@
         </w:tc>
       </w:tr>
     </w:tbl>
+    <w:p>
+      <w:pPr>
+        <w:spacing w:after="60"/>
+      </w:pPr>
+    </w:p>
+    <w:p>
+      <w:pPr>
+        <w:spacing w:after="160" w:line="360"/>
+      </w:pPr>
+      <w:r>
+        <w:rPr>
+          <w:b/>
+          <w:bCs/>
+          <w:color w:val="141414"/>
+        </w:rPr>
+        <w:t xml:space="preserve">Delivery chain, verified against the real world (July 2026): </w:t>
+      </w:r>
+      <w:r>
+        <w:rPr>
+          <w:color w:val="141414"/>
+        </w:rPr>
+        <w:t xml:space="preserve">Trinks natively exports a client-debt report and a package-balance report — the audit’s two money buckets are ready-made files, not an integration project. Asaas split is live for Pix, boleto and card via API with subaccounts — the fee routes itself. Full Google-review histories are fetchable through licensed APIs for a few reais per salon. And the floor sending mode — reception sends a generated one-tap list from the salon’s own phone — works for any salon on day one, no platform required.</w:t>
+      </w:r>
+    </w:p>
     <w:p>
       <w:r>
         <w:br w:type="page"/>
@@ -1789,13 +1813,13 @@
           <w:bCs/>
           <w:color w:val="141414"/>
         </w:rPr>
-        <w:t xml:space="preserve">Rung 0 is free and self-serve</w:t>
-      </w:r>
-      <w:r>
-        <w:rPr>
-          <w:color w:val="141414"/>
-        </w:rPr>
-        <w:t xml:space="preserve"> because leads must cost nothing and qualify themselves. </w:t>
+        <w:t xml:space="preserve">Rung 0 is free, unsolicited, and never for sale</w:t>
+      </w:r>
+      <w:r>
+        <w:rPr>
+          <w:color w:val="141414"/>
+        </w:rPr>
+        <w:t xml:space="preserve"> — a gift built from public data that costs her prospects nothing and demonstrates the craft. </w:t>
       </w:r>
       <w:r>
         <w:rPr>
@@ -2177,7 +2201,7 @@
                 <w:sz w:val="22"/>
                 <w:szCs w:val="22"/>
               </w:rPr>
-              <w:t xml:space="preserve">Free Auditoria por Áudio → personalized PDF</w:t>
+              <w:t xml:space="preserve">Free Auditoria de Voz (gift, from public data) → delivery chat qualifies</w:t>
             </w:r>
           </w:p>
         </w:tc>
@@ -2544,7 +2568,7 @@
           <w:bCs/>
           <w:color w:val="0B4A36"/>
         </w:rPr>
-        <w:t xml:space="preserve">§7 · Rung 0 — the free voice audit (the lead machine)</w:t>
+        <w:t xml:space="preserve">§7 · Rung 0 — the Auditoria de Voz (the gift that opens every door)</w:t>
       </w:r>
     </w:p>
     <w:p>
@@ -2555,21 +2579,35 @@
         <w:rPr>
           <w:color w:val="141414"/>
         </w:rPr>
-        <w:t xml:space="preserve">Brazilian salon owners live on WhatsApp voice notes — so the lead magnet meets them there. From any link or QR code: the owner taps, and a warm bot asks </w:t>
-      </w:r>
-      <w:r>
-        <w:rPr>
-          <w:b/>
-          <w:bCs/>
-          <w:color w:val="141414"/>
-        </w:rPr>
-        <w:t xml:space="preserve">eight questions she can answer by voice</w:t>
-      </w:r>
-      <w:r>
-        <w:rPr>
-          <w:color w:val="141414"/>
-        </w:rPr>
-        <w:t xml:space="preserve"> while drying a client’s hair:</w:t>
+        <w:t xml:space="preserve">Built entirely from </w:t>
+      </w:r>
+      <w:r>
+        <w:rPr>
+          <w:b/>
+          <w:bCs/>
+          <w:color w:val="141414"/>
+        </w:rPr>
+        <w:t xml:space="preserve">public data</w:t>
+      </w:r>
+      <w:r>
+        <w:rPr>
+          <w:color w:val="141414"/>
+        </w:rPr>
+        <w:t xml:space="preserve"> — the salon’s Google reviews (fetched in full via a licensed reviews API; the official API caps at 5, third-party APIs fetch all for a few reais per business), Instagram posts and comments, the WhatsApp greeting, the site. Because it needs </w:t>
+      </w:r>
+      <w:r>
+        <w:rPr>
+          <w:b/>
+          <w:bCs/>
+          <w:color w:val="141414"/>
+        </w:rPr>
+        <w:t xml:space="preserve">nothing from the owner</w:t>
+      </w:r>
+      <w:r>
+        <w:rPr>
+          <w:color w:val="141414"/>
+        </w:rPr>
+        <w:t xml:space="preserve">, it can be made unsolicited, as a gift — the perfect cold open, with zero LGPD friction. Five sections, Casulo-grade:</w:t>
       </w:r>
     </w:p>
     <w:p>
@@ -2583,9 +2621,17 @@
       </w:pPr>
       <w:r>
         <w:rPr>
-          <w:color w:val="141414"/>
-        </w:rPr>
-        <w:t xml:space="preserve">Faturamento mensal aproximado? (faixas) · Quantas clientes ativas? · Ticket médio?</w:t>
+          <w:b/>
+          <w:bCs/>
+          <w:color w:val="141414"/>
+        </w:rPr>
+        <w:t xml:space="preserve">Como você se apresenta </w:t>
+      </w:r>
+      <w:r>
+        <w:rPr>
+          <w:color w:val="141414"/>
+        </w:rPr>
+        <w:t xml:space="preserve">— the brand voice her channels project (warm? premium? playful?), with her own phrases quoted.</w:t>
       </w:r>
     </w:p>
     <w:p>
@@ -2599,9 +2645,17 @@
       </w:pPr>
       <w:r>
         <w:rPr>
-          <w:color w:val="141414"/>
-        </w:rPr>
-        <w:t xml:space="preserve">Vende pacotes ou planos? Quanto do faturamento? · Quantos furos (no-show) por semana?</w:t>
+          <w:b/>
+          <w:bCs/>
+          <w:color w:val="141414"/>
+        </w:rPr>
+        <w:t xml:space="preserve">Como suas clientes te veem </w:t>
+      </w:r>
+      <w:r>
+        <w:rPr>
+          <w:color w:val="141414"/>
+        </w:rPr>
+        <w:t xml:space="preserve">— the customer voice from reviews: what they love (by name — “a Carol é maravilhosa”), what they complain about, the normalized rating math (deterministic, code-computed).</w:t>
       </w:r>
     </w:p>
     <w:p>
@@ -2615,34 +2669,17 @@
       </w:pPr>
       <w:r>
         <w:rPr>
-          <w:color w:val="141414"/>
-        </w:rPr>
-        <w:t xml:space="preserve">Tem cliente te devendo? Quanto, chutando? · Há quanto tempo não chama quem sumiu? · Qual sistema de agenda você usa?</w:t>
-      </w:r>
-    </w:p>
-    <w:p>
-      <w:pPr>
-        <w:spacing w:after="160" w:line="360"/>
-      </w:pPr>
-      <w:r>
-        <w:rPr>
-          <w:color w:val="141414"/>
-        </w:rPr>
-        <w:t xml:space="preserve">The engine transcribes, runs a </w:t>
-      </w:r>
-      <w:r>
-        <w:rPr>
-          <w:b/>
-          <w:bCs/>
-          <w:color w:val="141414"/>
-        </w:rPr>
-        <w:t xml:space="preserve">published, conservative calculator</w:t>
-      </w:r>
-      <w:r>
-        <w:rPr>
-          <w:color w:val="141414"/>
-        </w:rPr>
-        <w:t xml:space="preserve"> (never the AI guessing), and replies in under two minutes with a branded PDF — </w:t>
+          <w:b/>
+          <w:bCs/>
+          <w:color w:val="141414"/>
+        </w:rPr>
+        <w:t xml:space="preserve">O gap </w:t>
+      </w:r>
+      <w:r>
+        <w:rPr>
+          <w:color w:val="141414"/>
+        </w:rPr>
+        <w:t xml:space="preserve">— where promise and experience diverge: </w:t>
       </w:r>
       <w:r>
         <w:rPr>
@@ -2650,13 +2687,55 @@
           <w:iCs/>
           <w:color w:val="5B6B66"/>
         </w:rPr>
-        <w:t xml:space="preserve">Raio-X Estimado do Seu Caixa</w:t>
-      </w:r>
-      <w:r>
-        <w:rPr>
-          <w:color w:val="141414"/>
-        </w:rPr>
-        <w:t xml:space="preserve"> — her salon’s name on the cover, three bucket estimates with the arithmetic shown, a sector benchmark line, and one honest sentence: </w:t>
+        <w:t xml:space="preserve">“você vende acolhimento; 40% das queixas são resposta lenta.”</w:t>
+      </w:r>
+    </w:p>
+    <w:p>
+      <w:pPr>
+        <w:pStyle w:val="ListParagraph"/>
+        <w:numPr>
+          <w:ilvl w:val="0"/>
+          <w:numId w:val="2"/>
+        </w:numPr>
+        <w:spacing w:after="100" w:line="340"/>
+      </w:pPr>
+      <w:r>
+        <w:rPr>
+          <w:b/>
+          <w:bCs/>
+          <w:color w:val="141414"/>
+        </w:rPr>
+        <w:t xml:space="preserve">A prioridade </w:t>
+      </w:r>
+      <w:r>
+        <w:rPr>
+          <w:color w:val="141414"/>
+        </w:rPr>
+        <w:t xml:space="preserve">— the one thing to fix first. One, not thirty.</w:t>
+      </w:r>
+    </w:p>
+    <w:p>
+      <w:pPr>
+        <w:pStyle w:val="ListParagraph"/>
+        <w:numPr>
+          <w:ilvl w:val="0"/>
+          <w:numId w:val="2"/>
+        </w:numPr>
+        <w:spacing w:after="100" w:line="340"/>
+      </w:pPr>
+      <w:r>
+        <w:rPr>
+          <w:b/>
+          <w:bCs/>
+          <w:color w:val="141414"/>
+        </w:rPr>
+        <w:t xml:space="preserve">A ponte </w:t>
+      </w:r>
+      <w:r>
+        <w:rPr>
+          <w:color w:val="141414"/>
+        </w:rPr>
+        <w:t xml:space="preserve">— the gap named in money: </w:t>
       </w:r>
       <w:r>
         <w:rPr>
@@ -2664,7 +2743,7 @@
           <w:iCs/>
           <w:color w:val="0A6E4C"/>
         </w:rPr>
-        <w:t xml:space="preserve">"isto é uma estimativa conservadora — o número real, com nome e valor, sai do Raio-X completo: R$490, com garantia."</w:t>
+        <w:t xml:space="preserve">"clientes que amam o método mas não conseguem usar o pacote, e somem. Isso é dinheiro dormindo. Quer o número real, com nome e valor? Raio-X do Caixa — R$490, com garantia."</w:t>
       </w:r>
     </w:p>
     <w:p>
@@ -2673,9 +2752,120 @@
       </w:pPr>
       <w:r>
         <w:rPr>
-          <w:color w:val="141414"/>
-        </w:rPr>
-        <w:t xml:space="preserve">Every completed audio audit lands in her pipeline auto-scored: revenue band, packages yes/no, agenda system (which also answers the data question before she ever talks to them). Cost per lead ≈ R$0. The eighth question is secretly the intake form.</w:t>
+          <w:b/>
+          <w:bCs/>
+          <w:color w:val="141414"/>
+        </w:rPr>
+        <w:t xml:space="preserve">Triple duty: </w:t>
+      </w:r>
+      <w:r>
+        <w:rPr>
+          <w:color w:val="141414"/>
+        </w:rPr>
+        <w:t xml:space="preserve">(1) the lead magnet — magnetic, giftable, demonstrates the exact craft the business runs on; (2) </w:t>
+      </w:r>
+      <w:r>
+        <w:rPr>
+          <w:b/>
+          <w:bCs/>
+          <w:color w:val="141414"/>
+        </w:rPr>
+        <w:t xml:space="preserve">voice calibration</w:t>
+      </w:r>
+      <w:r>
+        <w:rPr>
+          <w:color w:val="141414"/>
+        </w:rPr>
+        <w:t xml:space="preserve"> — the brand-voice half becomes the tone profile the wave engine writes with, so recovery messages provably sound like her; (3) </w:t>
+      </w:r>
+      <w:r>
+        <w:rPr>
+          <w:b/>
+          <w:bCs/>
+          <w:color w:val="141414"/>
+        </w:rPr>
+        <w:t xml:space="preserve">recovery intelligence</w:t>
+      </w:r>
+      <w:r>
+        <w:rPr>
+          <w:color w:val="141414"/>
+        </w:rPr>
+        <w:t xml:space="preserve"> — the customer-voice half tells the engine WHY clients drift (favorite professional left, can’t book, price jump), so win-back messages address the real reason, never a generic “sentimos sua falta”.</w:t>
+      </w:r>
+    </w:p>
+    <w:p>
+      <w:pPr>
+        <w:spacing w:after="160" w:line="360"/>
+      </w:pPr>
+      <w:r>
+        <w:rPr>
+          <w:b/>
+          <w:bCs/>
+          <w:color w:val="141414"/>
+        </w:rPr>
+        <w:t xml:space="preserve">The funnel is one truth at three resolutions: </w:t>
+      </w:r>
+      <w:r>
+        <w:rPr>
+          <w:color w:val="141414"/>
+        </w:rPr>
+        <w:t xml:space="preserve">feeling (</w:t>
+      </w:r>
+      <w:r>
+        <w:rPr>
+          <w:i/>
+          <w:iCs/>
+          <w:color w:val="5B6B66"/>
+        </w:rPr>
+        <w:t xml:space="preserve">suas clientes dizem que não conseguem agendar o pacote</w:t>
+      </w:r>
+      <w:r>
+        <w:rPr>
+          <w:color w:val="141414"/>
+        </w:rPr>
+        <w:t xml:space="preserve">) → number (</w:t>
+      </w:r>
+      <w:r>
+        <w:rPr>
+          <w:i/>
+          <w:iCs/>
+          <w:color w:val="5B6B66"/>
+        </w:rPr>
+        <w:t xml:space="preserve">são R$18.400 em pacotes parados</w:t>
+      </w:r>
+      <w:r>
+        <w:rPr>
+          <w:color w:val="141414"/>
+        </w:rPr>
+        <w:t xml:space="preserve">) → money (</w:t>
+      </w:r>
+      <w:r>
+        <w:rPr>
+          <w:i/>
+          <w:iCs/>
+          <w:color w:val="5B6B66"/>
+        </w:rPr>
+        <w:t xml:space="preserve">recuperei R$11.200 esse mês</w:t>
+      </w:r>
+      <w:r>
+        <w:rPr>
+          <w:color w:val="141414"/>
+        </w:rPr>
+        <w:t xml:space="preserve">). Each rung zooms in; the subject never changes. Delivery chat follow-up doubles as qualification: </w:t>
+      </w:r>
+      <w:r>
+        <w:rPr>
+          <w:i/>
+          <w:iCs/>
+          <w:color w:val="0A6E4C"/>
+        </w:rPr>
+        <w:t xml:space="preserve">"qual sistema você usa — Trinks, Belasis, Avec?"</w:t>
+      </w:r>
+      <w:r>
+        <w:rPr>
+          <w:color w:val="141414"/>
+        </w:rPr>
+        <w:t xml:space="preserve"> answers the data question before the R$490 is ever offered. The audit stays free and internal forever — it is a door and an engine input, never a paid product; charging for it would drift into crowded salon-marketing consulting, exactly the red ocean this business avoids.</w:t>
       </w:r>
     </w:p>
     <w:p>
@@ -3366,7 +3556,7 @@
                 <w:sz w:val="22"/>
                 <w:szCs w:val="22"/>
               </w:rPr>
-              <w:t xml:space="preserve">Voice-audit bot: 8 questions, transcription, calculator, branded PDF, lead scoring into the pipeline</w:t>
+              <w:t xml:space="preserve">Auditoria de Voz factory: reviews ingestion (licensed API), brand-channel reader, deterministic rating math, gap analysis, branded PDF, voice-profile + drift-reasons extraction, lead scoring</w:t>
             </w:r>
           </w:p>
         </w:tc>
@@ -3391,7 +3581,7 @@
                 <w:sz w:val="22"/>
                 <w:szCs w:val="22"/>
               </w:rPr>
-              <w:t xml:space="preserve">Autonomous 24/7</w:t>
+              <w:t xml:space="preserve">Batch, ~R$5–15/audit</w:t>
             </w:r>
           </w:p>
         </w:tc>
@@ -4398,6 +4588,67 @@
           <w:bCs/>
           <w:color w:val="141414"/>
         </w:rPr>
+        <w:t xml:space="preserve">Two inputs from the Auditoria de Voz make the waves land: </w:t>
+      </w:r>
+      <w:r>
+        <w:rPr>
+          <w:color w:val="141414"/>
+        </w:rPr>
+        <w:t xml:space="preserve">the </w:t>
+      </w:r>
+      <w:r>
+        <w:rPr>
+          <w:b/>
+          <w:bCs/>
+          <w:color w:val="141414"/>
+        </w:rPr>
+        <w:t xml:space="preserve">voice profile</w:t>
+      </w:r>
+      <w:r>
+        <w:rPr>
+          <w:color w:val="141414"/>
+        </w:rPr>
+        <w:t xml:space="preserve"> (tone, greetings, emoji habits, how she says “oi amor”) is the style config every template is written against — messages provably sound like her; and the </w:t>
+      </w:r>
+      <w:r>
+        <w:rPr>
+          <w:b/>
+          <w:bCs/>
+          <w:color w:val="141414"/>
+        </w:rPr>
+        <w:t xml:space="preserve">drift reasons</w:t>
+      </w:r>
+      <w:r>
+        <w:rPr>
+          <w:color w:val="141414"/>
+        </w:rPr>
+        <w:t xml:space="preserve"> (favorite professional left, booking friction, price jump) route each dormant client to a message that answers her actual reason for leaving — </w:t>
+      </w:r>
+      <w:r>
+        <w:rPr>
+          <w:i/>
+          <w:iCs/>
+          <w:color w:val="0A6E4C"/>
+        </w:rPr>
+        <w:t xml:space="preserve">"a Duda saiu, mas a Carol assumiu as alunas dela — vem fazer uma aula por conta da casa?"</w:t>
+      </w:r>
+      <w:r>
+        <w:rPr>
+          <w:color w:val="141414"/>
+        </w:rPr>
+        <w:t xml:space="preserve"> — never a generic “sentimos sua falta”.</w:t>
+      </w:r>
+    </w:p>
+    <w:p>
+      <w:pPr>
+        <w:spacing w:after="160" w:line="360"/>
+      </w:pPr>
+      <w:r>
+        <w:rPr>
+          <w:b/>
+          <w:bCs/>
+          <w:color w:val="141414"/>
+        </w:rPr>
         <w:t xml:space="preserve">Two sending modes. </w:t>
       </w:r>
       <w:r>
@@ -4678,7 +4929,7 @@
                 <w:sz w:val="22"/>
                 <w:szCs w:val="22"/>
               </w:rPr>
-              <w:t xml:space="preserve">Entity + contracts started · CAPTA: bot, calculator, PDF · pipeline sheet</w:t>
+              <w:t xml:space="preserve">Entity + contracts started · CAPTA: reviews ingestion, gap analysis, voice-audit PDF factory · pipeline sheet</w:t>
             </w:r>
           </w:p>
         </w:tc>
@@ -4703,7 +4954,7 @@
                 <w:sz w:val="22"/>
                 <w:szCs w:val="22"/>
               </w:rPr>
-              <w:t xml:space="preserve">She completes her own audit by voice; PDF arrives in 2 min</w:t>
+              <w:t xml:space="preserve">Salão Aurora’s voice audit generates end-to-end from planted reviews</w:t>
             </w:r>
           </w:p>
         </w:tc>

</xml_diff>

<commit_message>
Add Competition & Moat, KISS operating architecture, and loose-spot fixes to v2
Competitive map (DIY tools, platform checkboxes, Winback Engine US
model) with positioning rules and the pilot promise; frozen-stack rule;
five-numbers/three-rituals/rule-of-one management layer with pre-written
tripwires; post-termination fee window and retention schedule in the
contract stack; thin-reviews fallback; week-1 competitor scan.

Co-Authored-By: Claude Fable 5 <noreply@anthropic.com>
Claude-Session: https://claude.ai/code/session_014mavYpYo1uVZXnrTYH94be
</commit_message>
<xml_diff>
--- a/CAIXA_CHEIA_V2.docx
+++ b/CAIXA_CHEIA_V2.docx
@@ -924,6 +924,25 @@
       </w:r>
     </w:p>
     <w:p>
+      <w:pPr>
+        <w:spacing w:after="160" w:line="360"/>
+      </w:pPr>
+      <w:r>
+        <w:rPr>
+          <w:b/>
+          <w:bCs/>
+          <w:color w:val="141414"/>
+        </w:rPr>
+        <w:t xml:space="preserve">And the lane is verified open: </w:t>
+      </w:r>
+      <w:r>
+        <w:rPr>
+          <w:color w:val="141414"/>
+        </w:rPr>
+        <w:t xml:space="preserve">Brazil is full of DIY reactivation tools (SocialHub, iZap, RobotiZap) and platform checkboxes — all things the owner must operate herself — and has no visible done-for-you, success-fee operator for beauty. In the US, Winback Engine proves the exact model at 20% of net recovered revenue. Demand proven, model proven, position unoccupied. (§2 has the full map and the positioning rules.)</w:t>
+      </w:r>
+    </w:p>
+    <w:p>
       <w:r>
         <w:br w:type="page"/>
       </w:r>
@@ -1205,6 +1224,284 @@
           <w:color w:val="141414"/>
         </w:rPr>
         <w:t xml:space="preserve">Once the salon’s booking deposits run through her Pix links, she is no longer a campaign — she is infrastructure. Even an account whose backlog is fully cured keeps paying the rail. This is the lock-in that survives her own success.</w:t>
+      </w:r>
+    </w:p>
+    <w:p>
+      <w:pPr>
+        <w:spacing w:after="60"/>
+      </w:pPr>
+    </w:p>
+    <w:p>
+      <w:pPr>
+        <w:pStyle w:val="Heading3"/>
+        <w:spacing w:after="120" w:before="220"/>
+      </w:pPr>
+      <w:r>
+        <w:rPr>
+          <w:b/>
+          <w:bCs/>
+          <w:color w:val="141414"/>
+        </w:rPr>
+        <w:t xml:space="preserve">The field, honestly — verified July 2026</w:t>
+      </w:r>
+    </w:p>
+    <w:p>
+      <w:pPr>
+        <w:spacing w:after="160" w:line="360"/>
+      </w:pPr>
+      <w:r>
+        <w:rPr>
+          <w:color w:val="141414"/>
+        </w:rPr>
+        <w:t xml:space="preserve">Reactivation is not empty space — it is </w:t>
+      </w:r>
+      <w:r>
+        <w:rPr>
+          <w:b/>
+          <w:bCs/>
+          <w:color w:val="141414"/>
+        </w:rPr>
+        <w:t xml:space="preserve">crowded with tools and empty of outcomes</w:t>
+      </w:r>
+      <w:r>
+        <w:rPr>
+          <w:color w:val="141414"/>
+        </w:rPr>
+        <w:t xml:space="preserve">. DIY WhatsApp win-back tools (SocialHub, iZap, RobotiZap and a dozen more) sell segmentation and disparos as monthly SaaS the owner must operate herself. The platforms are commoditizing the feature — Trinks’ own blog teaches reactivation campaigns and ships birthday automations. Deposit and recurring-billing tools exist (Frizzar sells cobrança de sinal; Vindi and InfinitePay do recurrence). And in the US, </w:t>
+      </w:r>
+      <w:r>
+        <w:rPr>
+          <w:b/>
+          <w:bCs/>
+          <w:color w:val="141414"/>
+        </w:rPr>
+        <w:t xml:space="preserve">Winback Engine proves the exact model</w:t>
+      </w:r>
+      <w:r>
+        <w:rPr>
+          <w:color w:val="141414"/>
+        </w:rPr>
+        <w:t xml:space="preserve"> — done-for-you win-back at 20% of net recovered revenue, no monthly fee, aimed at multi-location service businesses — with no visible equivalent in Brazilian beauty.</w:t>
+      </w:r>
+    </w:p>
+    <w:p>
+      <w:pPr>
+        <w:spacing w:after="160" w:line="360"/>
+      </w:pPr>
+      <w:r>
+        <w:rPr>
+          <w:color w:val="141414"/>
+        </w:rPr>
+        <w:t xml:space="preserve">Read that as a market saying yes: demand proven, money proven, model proven elsewhere — </w:t>
+      </w:r>
+      <w:r>
+        <w:rPr>
+          <w:b/>
+          <w:bCs/>
+          <w:color w:val="141414"/>
+        </w:rPr>
+        <w:t xml:space="preserve">position unoccupied</w:t>
+      </w:r>
+      <w:r>
+        <w:rPr>
+          <w:color w:val="141414"/>
+        </w:rPr>
+        <w:t xml:space="preserve">. Every Brazilian competitor sells a tool; the owner already had tools and didn’t use them, because the job was never information — it was the awkward work. Done-for-you plus success-fee is the entire difference. And the collections bucket is the least contested of all: nobody wants to chase salon debts for a living. She does — politely, in code.</w:t>
+      </w:r>
+    </w:p>
+    <w:p>
+      <w:pPr>
+        <w:pStyle w:val="Heading3"/>
+        <w:spacing w:after="120" w:before="220"/>
+      </w:pPr>
+      <w:r>
+        <w:rPr>
+          <w:b/>
+          <w:bCs/>
+          <w:color w:val="141414"/>
+        </w:rPr>
+        <w:t xml:space="preserve">Positioning rules — never break these</w:t>
+      </w:r>
+    </w:p>
+    <w:p>
+      <w:pPr>
+        <w:pStyle w:val="ListParagraph"/>
+        <w:numPr>
+          <w:ilvl w:val="0"/>
+          <w:numId w:val="2"/>
+        </w:numPr>
+        <w:spacing w:after="100" w:line="340"/>
+      </w:pPr>
+      <w:r>
+        <w:rPr>
+          <w:b/>
+          <w:bCs/>
+          <w:color w:val="141414"/>
+        </w:rPr>
+        <w:t xml:space="preserve">Never sell “software” or “automação”. </w:t>
+      </w:r>
+      <w:r>
+        <w:rPr>
+          <w:color w:val="141414"/>
+        </w:rPr>
+        <w:t xml:space="preserve">She would be compared to R$99/month tools and lose. She sells: </w:t>
+      </w:r>
+      <w:r>
+        <w:rPr>
+          <w:i/>
+          <w:iCs/>
+          <w:color w:val="0A6E4C"/>
+        </w:rPr>
+        <w:t xml:space="preserve">"eu faço, e você só paga do que voltar."</w:t>
+      </w:r>
+    </w:p>
+    <w:p>
+      <w:pPr>
+        <w:pStyle w:val="ListParagraph"/>
+        <w:numPr>
+          <w:ilvl w:val="0"/>
+          <w:numId w:val="2"/>
+        </w:numPr>
+        <w:spacing w:after="100" w:line="340"/>
+      </w:pPr>
+      <w:r>
+        <w:rPr>
+          <w:b/>
+          <w:bCs/>
+          <w:color w:val="141414"/>
+        </w:rPr>
+        <w:t xml:space="preserve">Never charge a mensalidade. </w:t>
+      </w:r>
+      <w:r>
+        <w:rPr>
+          <w:color w:val="141414"/>
+        </w:rPr>
+        <w:t xml:space="preserve">The moment a monthly fee exists, she competes with every SaaS above on their terms.</w:t>
+      </w:r>
+    </w:p>
+    <w:p>
+      <w:pPr>
+        <w:pStyle w:val="ListParagraph"/>
+        <w:numPr>
+          <w:ilvl w:val="0"/>
+          <w:numId w:val="2"/>
+        </w:numPr>
+        <w:spacing w:after="100" w:line="340"/>
+      </w:pPr>
+      <w:r>
+        <w:rPr>
+          <w:b/>
+          <w:bCs/>
+          <w:color w:val="141414"/>
+        </w:rPr>
+        <w:t xml:space="preserve">Always lead with the voice audit. </w:t>
+      </w:r>
+      <w:r>
+        <w:rPr>
+          <w:color w:val="141414"/>
+        </w:rPr>
+        <w:t xml:space="preserve">Nobody else in the market opens with “o que suas clientes estão dizendo”. It is the one unclaimed front door.</w:t>
+      </w:r>
+    </w:p>
+    <w:p>
+      <w:pPr>
+        <w:pStyle w:val="ListParagraph"/>
+        <w:numPr>
+          <w:ilvl w:val="0"/>
+          <w:numId w:val="2"/>
+        </w:numPr>
+        <w:spacing w:after="100" w:line="340"/>
+      </w:pPr>
+      <w:r>
+        <w:rPr>
+          <w:b/>
+          <w:bCs/>
+          <w:color w:val="141414"/>
+        </w:rPr>
+        <w:t xml:space="preserve">The moats are time-based — say so. </w:t>
+      </w:r>
+      <w:r>
+        <w:rPr>
+          <w:color w:val="141414"/>
+        </w:rPr>
+        <w:t xml:space="preserve">The method is copyable in two months; the recovery-rate dataset, the distributor relationships, and a good name in a ~400-salon market are not. Speed is the strategy; month one being slow costs the only thing that can’t be bought back.</w:t>
+      </w:r>
+    </w:p>
+    <w:p>
+      <w:pPr>
+        <w:pStyle w:val="ListParagraph"/>
+        <w:numPr>
+          <w:ilvl w:val="0"/>
+          <w:numId w:val="2"/>
+        </w:numPr>
+        <w:spacing w:after="100" w:line="340"/>
+      </w:pPr>
+      <w:r>
+        <w:rPr>
+          <w:b/>
+          <w:bCs/>
+          <w:color w:val="141414"/>
+        </w:rPr>
+        <w:t xml:space="preserve">Who could kill it, watched openly: </w:t>
+      </w:r>
+      <w:r>
+        <w:rPr>
+          <w:color w:val="141414"/>
+        </w:rPr>
+        <w:t xml:space="preserve">Trinks shipping done-for-you collections (unlikely — tool DNA, success-fee liability, and their analytics can never conclude “your platform setup is losing you money”); or a fast copycat cloning Winback Engine for salons (possible — which is exactly why she launches now and hoards the dataset).</w:t>
+      </w:r>
+    </w:p>
+    <w:p>
+      <w:pPr>
+        <w:pStyle w:val="Heading3"/>
+        <w:spacing w:after="120" w:before="220"/>
+      </w:pPr>
+      <w:r>
+        <w:rPr>
+          <w:b/>
+          <w:bCs/>
+          <w:color w:val="141414"/>
+        </w:rPr>
+        <w:t xml:space="preserve">The pilot promise (ported from the US playbook)</w:t>
+      </w:r>
+    </w:p>
+    <w:p>
+      <w:pPr>
+        <w:spacing w:after="160" w:line="360"/>
+      </w:pPr>
+      <w:r>
+        <w:rPr>
+          <w:color w:val="141414"/>
+        </w:rPr>
+        <w:t xml:space="preserve">Winback Engine de-risks with “5× your fees in 30 days or your money back.” Her version, KISS: the R$490 audit already guarantees </w:t>
+      </w:r>
+      <w:r>
+        <w:rPr>
+          <w:b/>
+          <w:bCs/>
+          <w:color w:val="141414"/>
+        </w:rPr>
+        <w:t xml:space="preserve">≥R$3.000 found — six times the price — or refunded</w:t>
+      </w:r>
+      <w:r>
+        <w:rPr>
+          <w:color w:val="141414"/>
+        </w:rPr>
+        <w:t xml:space="preserve">. When the owner signs the mandate on the delivery call, </w:t>
+      </w:r>
+      <w:r>
+        <w:rPr>
+          <w:b/>
+          <w:bCs/>
+          <w:color w:val="141414"/>
+        </w:rPr>
+        <w:t xml:space="preserve">the R$490 is credited against the first success fee</w:t>
+      </w:r>
+      <w:r>
+        <w:rPr>
+          <w:color w:val="141414"/>
+        </w:rPr>
+        <w:t xml:space="preserve">. And if the first backlog wave recovers nothing, the audit is refunded too. Nobody can lose money trying her — and she can afford that promise because the finder is deterministic.</w:t>
       </w:r>
     </w:p>
     <w:p>
@@ -2752,6 +3049,17 @@
       </w:pPr>
       <w:r>
         <w:rPr>
+          <w:color w:val="141414"/>
+        </w:rPr>
+        <w:t xml:space="preserve">Salons with too few public reviews (under ~40) still get a door: the brand-voice half plus the self-serve audio variant — eight questions answered by WhatsApp voice note, a deterministic calculator, the same PDF. The funnel never closes for lack of data.</w:t>
+      </w:r>
+    </w:p>
+    <w:p>
+      <w:pPr>
+        <w:spacing w:after="160" w:line="360"/>
+      </w:pPr>
+      <w:r>
+        <w:rPr>
           <w:b/>
           <w:bCs/>
           <w:color w:val="141414"/>
@@ -3398,6 +3706,30 @@
         </w:tc>
       </w:tr>
     </w:tbl>
+    <w:p>
+      <w:pPr>
+        <w:spacing w:after="60"/>
+      </w:pPr>
+    </w:p>
+    <w:p>
+      <w:pPr>
+        <w:spacing w:after="160" w:line="360"/>
+      </w:pPr>
+      <w:r>
+        <w:rPr>
+          <w:b/>
+          <w:bCs/>
+          <w:color w:val="141414"/>
+        </w:rPr>
+        <w:t xml:space="preserve">The stack is frozen — on purpose. </w:t>
+      </w:r>
+      <w:r>
+        <w:rPr>
+          <w:color w:val="141414"/>
+        </w:rPr>
+        <w:t xml:space="preserve">One repo, one FastAPI service, one Postgres, one server, daily backup. WhatsApp + Asaas + a PDF engine, and nothing else without deleting something first. No microservices, no queues, no second database. Every module is a folder; every behavior is a written spec that Claude Code maintains (the SKILL.md pattern) — she changes the business by editing sentences, not code. Boring technology is a feature: the company must survive her taking a week off, and it will, because the machine’s whole shape fits in one person’s head.</w:t>
+      </w:r>
+    </w:p>
     <w:p>
       <w:pPr>
         <w:spacing w:after="60"/>
@@ -6851,7 +7183,35 @@
         <w:rPr>
           <w:color w:val="141414"/>
         </w:rPr>
-        <w:t xml:space="preserve">service contract (mandate scope, the 25%, attribution definition, monthly reconciliation, liability cap, labour-law exclusion) · DPA (salon = controladora, she = operadora; AI provider named as sub-operator; international-transfer clause per ANPD Res. 19/2024) · LIA template handed to the salon · mutual NDA.</w:t>
+        <w:t xml:space="preserve">service contract (mandate scope, the 25%, attribution definition, monthly reconciliation, liability cap, labour-law exclusion, </w:t>
+      </w:r>
+      <w:r>
+        <w:rPr>
+          <w:b/>
+          <w:bCs/>
+          <w:color w:val="141414"/>
+        </w:rPr>
+        <w:t xml:space="preserve">post-termination window</w:t>
+      </w:r>
+      <w:r>
+        <w:rPr>
+          <w:color w:val="141414"/>
+        </w:rPr>
+        <w:t xml:space="preserve"> — fees due on recoveries attributable to contacts made before cancellation, for 30 days after) · DPA (salon = controladora, she = operadora; AI provider named as sub-operator; international-transfer clause per ANPD Res. 19/2024; </w:t>
+      </w:r>
+      <w:r>
+        <w:rPr>
+          <w:b/>
+          <w:bCs/>
+          <w:color w:val="141414"/>
+        </w:rPr>
+        <w:t xml:space="preserve">retention schedule</w:t>
+      </w:r>
+      <w:r>
+        <w:rPr>
+          <w:color w:val="141414"/>
+        </w:rPr>
+        <w:t xml:space="preserve"> — raw exports deleted at delivery +30 days, pseudonymized working set +90, written deletion confirmation) · LIA template handed to the salon · mutual NDA.</w:t>
       </w:r>
     </w:p>
     <w:p>
@@ -7164,7 +7524,7 @@
                 <w:sz w:val="22"/>
                 <w:szCs w:val="22"/>
               </w:rPr>
-              <w:t xml:space="preserve">Entity + contador + lawyer on contracts · Claude Code builds CAPTA + RAIO-X · Salão Aurora sample built and watermarked · CNPJ list pulled and scored</w:t>
+              <w:t xml:space="preserve">Entity + contador + lawyer on contracts · Claude Code builds CAPTA + RAIO-X · Salão Aurora sample built and watermarked · CNPJ list pulled and scored · 20-min competitor scan (Instagram/Google: “recuperação de clientes salão”) to confirm the lane is still open</w:t>
             </w:r>
           </w:p>
         </w:tc>
@@ -7617,6 +7977,160 @@
           <w:color w:val="141414"/>
         </w:rPr>
         <w:t xml:space="preserve">Mon — pipeline + new-account onboarding. Tue–Thu mornings — sales calls (audit deliveries); afternoons — first-wave reviews and disputes. Fri — Extrato review + content batch. The machine sends, collects, splits, reconciles and reports without her. Twenty-five hours a week runs it; the rest is growth.</w:t>
+      </w:r>
+    </w:p>
+    <w:p>
+      <w:pPr>
+        <w:spacing w:after="60"/>
+      </w:pPr>
+    </w:p>
+    <w:p>
+      <w:pPr>
+        <w:pStyle w:val="Heading1"/>
+        <w:spacing w:after="200" w:before="360"/>
+      </w:pPr>
+      <w:r>
+        <w:rPr>
+          <w:b/>
+          <w:bCs/>
+          <w:color w:val="0B4A36"/>
+        </w:rPr>
+        <w:t xml:space="preserve">§19 · Running it KISS — five numbers, three rituals, one rule</w:t>
+      </w:r>
+    </w:p>
+    <w:p>
+      <w:pPr>
+        <w:spacing w:after="160" w:line="360"/>
+      </w:pPr>
+      <w:r>
+        <w:rPr>
+          <w:color w:val="141414"/>
+        </w:rPr>
+        <w:t xml:space="preserve">The whole company is managed on </w:t>
+      </w:r>
+      <w:r>
+        <w:rPr>
+          <w:b/>
+          <w:bCs/>
+          <w:color w:val="141414"/>
+        </w:rPr>
+        <w:t xml:space="preserve">five numbers</w:t>
+      </w:r>
+      <w:r>
+        <w:rPr>
+          <w:color w:val="141414"/>
+        </w:rPr>
+        <w:t xml:space="preserve">, read from one dashboard: leads this week · audits sold · active mandates · R$ recovered this month · fee collected. If a report doesn’t move one of the five, it doesn’t exist. No CRM, no project tool, no marketing stack — WhatsApp, the PAINEL, and one pipeline sheet.</w:t>
+      </w:r>
+    </w:p>
+    <w:p>
+      <w:pPr>
+        <w:pStyle w:val="ListParagraph"/>
+        <w:numPr>
+          <w:ilvl w:val="0"/>
+          <w:numId w:val="2"/>
+        </w:numPr>
+        <w:spacing w:after="100" w:line="340"/>
+      </w:pPr>
+      <w:r>
+        <w:rPr>
+          <w:b/>
+          <w:bCs/>
+          <w:color w:val="141414"/>
+        </w:rPr>
+        <w:t xml:space="preserve">Monday, 30 minutes — the pipeline: </w:t>
+      </w:r>
+      <w:r>
+        <w:rPr>
+          <w:color w:val="141414"/>
+        </w:rPr>
+        <w:t xml:space="preserve">leads → audits → mandates; pick the week’s ten outreach targets. Done before coffee is cold.</w:t>
+      </w:r>
+    </w:p>
+    <w:p>
+      <w:pPr>
+        <w:pStyle w:val="ListParagraph"/>
+        <w:numPr>
+          <w:ilvl w:val="0"/>
+          <w:numId w:val="2"/>
+        </w:numPr>
+        <w:spacing w:after="100" w:line="340"/>
+      </w:pPr>
+      <w:r>
+        <w:rPr>
+          <w:b/>
+          <w:bCs/>
+          <w:color w:val="141414"/>
+        </w:rPr>
+        <w:t xml:space="preserve">Every morning, 2 hours — growth block: </w:t>
+      </w:r>
+      <w:r>
+        <w:rPr>
+          <w:color w:val="141414"/>
+        </w:rPr>
+        <w:t xml:space="preserve">prospecting and sales only. Delivery never invades it; afternoons belong to audit-delivery calls and first-wave reviews.</w:t>
+      </w:r>
+    </w:p>
+    <w:p>
+      <w:pPr>
+        <w:pStyle w:val="ListParagraph"/>
+        <w:numPr>
+          <w:ilvl w:val="0"/>
+          <w:numId w:val="2"/>
+        </w:numPr>
+        <w:spacing w:after="100" w:line="340"/>
+      </w:pPr>
+      <w:r>
+        <w:rPr>
+          <w:b/>
+          <w:bCs/>
+          <w:color w:val="141414"/>
+        </w:rPr>
+        <w:t xml:space="preserve">Friday, 1 hour — the close: </w:t>
+      </w:r>
+      <w:r>
+        <w:rPr>
+          <w:color w:val="141414"/>
+        </w:rPr>
+        <w:t xml:space="preserve">read every Extrato before it ships (first six months), batch next week’s content, log the five numbers. That log IS the board meeting.</w:t>
+      </w:r>
+    </w:p>
+    <w:p>
+      <w:pPr>
+        <w:spacing w:after="160" w:line="360"/>
+      </w:pPr>
+      <w:r>
+        <w:rPr>
+          <w:b/>
+          <w:bCs/>
+          <w:color w:val="141414"/>
+        </w:rPr>
+        <w:t xml:space="preserve">The rule of one: </w:t>
+      </w:r>
+      <w:r>
+        <w:rPr>
+          <w:color w:val="141414"/>
+        </w:rPr>
+        <w:t xml:space="preserve">one ICP, one city, one fee (25%), one channel priority per quarter, at most one new capability per month — and any new complexity must delete an old one. The moment operating the business needs a manual she hasn’t written, it has drifted; stop and simplify.</w:t>
+      </w:r>
+    </w:p>
+    <w:p>
+      <w:pPr>
+        <w:spacing w:after="160" w:line="360"/>
+      </w:pPr>
+      <w:r>
+        <w:rPr>
+          <w:b/>
+          <w:bCs/>
+          <w:color w:val="141414"/>
+        </w:rPr>
+        <w:t xml:space="preserve">Tripwires, with responses pre-written: </w:t>
+      </w:r>
+      <w:r>
+        <w:rPr>
+          <w:color w:val="141414"/>
+        </w:rPr>
+        <w:t xml:space="preserve">disputes &gt;1 per 50 accounts/month → freeze new onboarding, fix templates first. Wave replies &lt;5% two weeks running → pause that segment, rewrite with drift-reasons. First-wave review errors rising → push a delivery date, never the review. Churn &gt;5%/month → stop selling, interview the last five losses. Overload reveals itself in these numbers before any client feels it — that is what the numbers are for.</w:t>
       </w:r>
     </w:p>
     <w:p>
@@ -7701,7 +8215,7 @@
           <w:bCs/>
           <w:color w:val="0B4A36"/>
         </w:rPr>
-        <w:t xml:space="preserve">§19 · The levers, in order</w:t>
+        <w:t xml:space="preserve">§20 · The levers, in order</w:t>
       </w:r>
     </w:p>
     <w:p>
@@ -7840,7 +8354,7 @@
           <w:bCs/>
           <w:color w:val="0B4A36"/>
         </w:rPr>
-        <w:t xml:space="preserve">§20 · The endgame asset</w:t>
+        <w:t xml:space="preserve">§21 · The endgame asset</w:t>
       </w:r>
     </w:p>
     <w:p>

</xml_diff>